<commit_message>
Fix Word file validation: shade placeholders instead of highlight
Co-Authored-By: Claude Opus 5.5 <noreply@anthropic.com>
Claude-Session: https://claude.ai/code/session_01DYCMWq3RhJfK6nWEeNKm4R
</commit_message>
<xml_diff>
--- a/Qubik-Launch-Plan-v4.docx
+++ b/Qubik-Launch-Plan-v4.docx
@@ -104,8 +104,7 @@
           <w:rFonts w:ascii="Arial" w:cs="Arial" w:eastAsia="Arial" w:hAnsi="Arial"/>
           <w:sz w:val="22"/>
           <w:szCs w:val="22"/>
-          <w:highlight w:val="yellow"/>
-          <w:highlightCs w:val="yellow"/>
+          <w:shd w:fill="FFF200" w:color="auto" w:val="clear"/>
         </w:rPr>
         <w:t xml:space="preserve">⟦YOUR NAME⟧</w:t>
       </w:r>
@@ -122,8 +121,7 @@
           <w:rFonts w:ascii="Arial" w:cs="Arial" w:eastAsia="Arial" w:hAnsi="Arial"/>
           <w:sz w:val="22"/>
           <w:szCs w:val="22"/>
-          <w:highlight w:val="yellow"/>
-          <w:highlightCs w:val="yellow"/>
+          <w:shd w:fill="FFF200" w:color="auto" w:val="clear"/>
         </w:rPr>
         <w:t xml:space="preserve">⟦DATE⟧</w:t>
       </w:r>
@@ -186,8 +184,7 @@
           <w:rFonts w:ascii="Arial" w:cs="Arial" w:eastAsia="Arial" w:hAnsi="Arial"/>
           <w:sz w:val="18"/>
           <w:szCs w:val="18"/>
-          <w:highlight w:val="yellow"/>
-          <w:highlightCs w:val="yellow"/>
+          <w:shd w:fill="FFF200" w:color="auto" w:val="clear"/>
         </w:rPr>
         <w:t xml:space="preserve">⟦one line in your own words on what they were struggling with; keep it general, with no client names or numbers⟧</w:t>
       </w:r>
@@ -767,8 +764,7 @@
           <w:rFonts w:ascii="Arial" w:cs="Arial" w:eastAsia="Arial" w:hAnsi="Arial"/>
           <w:sz w:val="18"/>
           <w:szCs w:val="18"/>
-          <w:highlight w:val="yellow"/>
-          <w:highlightCs w:val="yellow"/>
+          <w:shd w:fill="FFF200" w:color="auto" w:val="clear"/>
         </w:rPr>
         <w:t xml:space="preserve">⟦confirm⟧</w:t>
       </w:r>
@@ -785,8 +781,7 @@
           <w:rFonts w:ascii="Arial" w:cs="Arial" w:eastAsia="Arial" w:hAnsi="Arial"/>
           <w:sz w:val="18"/>
           <w:szCs w:val="18"/>
-          <w:highlight w:val="yellow"/>
-          <w:highlightCs w:val="yellow"/>
+          <w:shd w:fill="FFF200" w:color="auto" w:val="clear"/>
         </w:rPr>
         <w:t xml:space="preserve">⟦ask Qubik⟧</w:t>
       </w:r>
@@ -4275,8 +4270,7 @@
           <w:rFonts w:ascii="Arial" w:cs="Arial" w:eastAsia="Arial" w:hAnsi="Arial"/>
           <w:sz w:val="18"/>
           <w:szCs w:val="18"/>
-          <w:highlight w:val="yellow"/>
-          <w:highlightCs w:val="yellow"/>
+          <w:shd w:fill="FFF200" w:color="auto" w:val="clear"/>
         </w:rPr>
         <w:t xml:space="preserve">⟦confirm⟧</w:t>
       </w:r>
@@ -4395,8 +4389,7 @@
           <w:rFonts w:ascii="Arial" w:cs="Arial" w:eastAsia="Arial" w:hAnsi="Arial"/>
           <w:sz w:val="18"/>
           <w:szCs w:val="18"/>
-          <w:highlight w:val="yellow"/>
-          <w:highlightCs w:val="yellow"/>
+          <w:shd w:fill="FFF200" w:color="auto" w:val="clear"/>
         </w:rPr>
         <w:t xml:space="preserve">⟦must be accurate; edit freely⟧</w:t>
       </w:r>
@@ -4441,8 +4434,7 @@
           <w:rFonts w:ascii="Arial" w:cs="Arial" w:eastAsia="Arial" w:hAnsi="Arial"/>
           <w:sz w:val="18"/>
           <w:szCs w:val="18"/>
-          <w:highlight w:val="yellow"/>
-          <w:highlightCs w:val="yellow"/>
+          <w:shd w:fill="FFF200" w:color="auto" w:val="clear"/>
         </w:rPr>
         <w:t xml:space="preserve">⟦Add your own.⟧</w:t>
       </w:r>
@@ -4507,8 +4499,7 @@
           <w:rFonts w:ascii="Arial" w:cs="Arial" w:eastAsia="Arial" w:hAnsi="Arial"/>
           <w:sz w:val="18"/>
           <w:szCs w:val="18"/>
-          <w:highlight w:val="yellow"/>
-          <w:highlightCs w:val="yellow"/>
+          <w:shd w:fill="FFF200" w:color="auto" w:val="clear"/>
         </w:rPr>
         <w:t xml:space="preserve">⟦cross-checked Meta numbers in Ads Manager, if you do⟧</w:t>
       </w:r>

</xml_diff>